<commit_message>
docs: redesign expansion plan with DAS logo, Segoe UI font, clean print layout, grounded small-scale phasing, and removed clearance box
</commit_message>
<xml_diff>
--- a/docs/DAS_Bahrain_Expansion_Plan.docx
+++ b/docs/DAS_Bahrain_Expansion_Plan.docx
@@ -19,11 +19,13 @@
       </w:r>
       <w:r>
         <w:rPr>
+          <w:b/>
+          <w:bCs/>
           <w:color w:val="059669"/>
           <w:sz w:val="18"/>
           <w:szCs w:val="18"/>
         </w:rPr>
-        <w:t xml:space="preserve">   [Slide 1 of 6]</w:t>
+        <w:t xml:space="preserve">   [Current Foundation • Page 1 of 6]</w:t>
       </w:r>
     </w:p>
     <w:p>
@@ -36,7 +38,7 @@
           <w:sz w:val="18"/>
           <w:szCs w:val="18"/>
         </w:rPr>
-        <w:t xml:space="preserve">Kingdom of Bahrain FMCG Distribution &amp; Alsi Cola Sole Franchisee</w:t>
+        <w:t xml:space="preserve">Kingdom of Bahrain FMCG Distribution &amp; Beverage Showcase</w:t>
       </w:r>
     </w:p>
     <w:p>
@@ -52,7 +54,7 @@
           <w:sz w:val="28"/>
           <w:szCs w:val="28"/>
         </w:rPr>
-        <w:t xml:space="preserve">Where We Are Today: A Solid Digital Foundation</w:t>
+        <w:t xml:space="preserve">Where We Stand Today: Current Website &amp; Foundation</w:t>
       </w:r>
     </w:p>
     <w:p>
@@ -65,7 +67,7 @@
           <w:sz w:val="20"/>
           <w:szCs w:val="20"/>
         </w:rPr>
-        <w:t xml:space="preserve">Our customer-facing web portal is already live, fast, and taking inquiries across Bahrain.</w:t>
+        <w:t xml:space="preserve">Our public web presence is already live, fast, and handling everyday customer inquiries across Bahrain.</w:t>
       </w:r>
     </w:p>
     <w:p>
@@ -89,65 +91,65 @@
           <w:sz w:val="20"/>
           <w:szCs w:val="20"/>
         </w:rPr>
-        <w:t xml:space="preserve">• Flagship FMCG Showcase: </w:t>
-      </w:r>
-      <w:r>
-        <w:rPr>
-          <w:sz w:val="20"/>
-          <w:szCs w:val="20"/>
-        </w:rPr>
-        <w:t xml:space="preserve">Dedicated showcase for Alsi Cola (Original &amp; Diet), Code Red energy drinks, juices, groceries, and hygiene products.
-</w:t>
-      </w:r>
-      <w:r>
-        <w:rPr>
-          <w:b/>
-          <w:bCs/>
-          <w:sz w:val="20"/>
-          <w:szCs w:val="20"/>
-        </w:rPr>
-        <w:t xml:space="preserve">• Wholesale Carton Switcher: </w:t>
-      </w:r>
-      <w:r>
-        <w:rPr>
-          <w:sz w:val="20"/>
-          <w:szCs w:val="20"/>
-        </w:rPr>
-        <w:t xml:space="preserve">Shoppers and cold store buyers can toggle instantly between individual cans and wholesale carton prices.
-</w:t>
-      </w:r>
-      <w:r>
-        <w:rPr>
-          <w:b/>
-          <w:bCs/>
-          <w:sz w:val="20"/>
-          <w:szCs w:val="20"/>
-        </w:rPr>
-        <w:t xml:space="preserve">• BenefitPay &amp; WhatsApp Checkout: </w:t>
-      </w:r>
-      <w:r>
-        <w:rPr>
-          <w:sz w:val="20"/>
-          <w:szCs w:val="20"/>
-        </w:rPr>
-        <w:t xml:space="preserve">Zero-friction order placement matching Bahrain consumer habits with instant BenefitPay QR and WhatsApp dispatch.
-</w:t>
-      </w:r>
-      <w:r>
-        <w:rPr>
-          <w:b/>
-          <w:bCs/>
-          <w:sz w:val="20"/>
-          <w:szCs w:val="20"/>
-        </w:rPr>
-        <w:t xml:space="preserve">• Mobile-Optimized &amp; Bilingual: </w:t>
-      </w:r>
-      <w:r>
-        <w:rPr>
-          <w:sz w:val="20"/>
-          <w:szCs w:val="20"/>
-        </w:rPr>
-        <w:t xml:space="preserve">Smooth experience on iOS Safari &amp; Android, with seamless English and Arabic language switching.
+        <w:t xml:space="preserve">• Flagship FMCG &amp; Alsi Cola: </w:t>
+      </w:r>
+      <w:r>
+        <w:rPr>
+          <w:sz w:val="20"/>
+          <w:szCs w:val="20"/>
+        </w:rPr>
+        <w:t xml:space="preserve">Showcases our key beverage lines (Alsi Cola Original &amp; Diet, Code Red, fruit juices) alongside groceries and hygiene supplies.
+</w:t>
+      </w:r>
+      <w:r>
+        <w:rPr>
+          <w:b/>
+          <w:bCs/>
+          <w:sz w:val="20"/>
+          <w:szCs w:val="20"/>
+        </w:rPr>
+        <w:t xml:space="preserve">• Carton vs. Single Unit Switch: </w:t>
+      </w:r>
+      <w:r>
+        <w:rPr>
+          <w:sz w:val="20"/>
+          <w:szCs w:val="20"/>
+        </w:rPr>
+        <w:t xml:space="preserve">Customers and cold store buyers can toggle between individual cans and wholesale carton rates instantly.
+</w:t>
+      </w:r>
+      <w:r>
+        <w:rPr>
+          <w:b/>
+          <w:bCs/>
+          <w:sz w:val="20"/>
+          <w:szCs w:val="20"/>
+        </w:rPr>
+        <w:t xml:space="preserve">• BenefitPay &amp; WhatsApp Orders: </w:t>
+      </w:r>
+      <w:r>
+        <w:rPr>
+          <w:sz w:val="20"/>
+          <w:szCs w:val="20"/>
+        </w:rPr>
+        <w:t xml:space="preserve">Matches local Bahrain habits: quick BenefitPay QR payments and direct WhatsApp messaging for orders.
+</w:t>
+      </w:r>
+      <w:r>
+        <w:rPr>
+          <w:b/>
+          <w:bCs/>
+          <w:sz w:val="20"/>
+          <w:szCs w:val="20"/>
+        </w:rPr>
+        <w:t xml:space="preserve">• Mobile &amp; Arabic Friendly: </w:t>
+      </w:r>
+      <w:r>
+        <w:rPr>
+          <w:sz w:val="20"/>
+          <w:szCs w:val="20"/>
+        </w:rPr>
+        <w:t xml:space="preserve">Fast and readable on smartphones, with an instant English/Arabic language toggle for local grocers.
 </w:t>
       </w:r>
     </w:p>
@@ -186,7 +188,7 @@
                 <w:sz w:val="20"/>
                 <w:szCs w:val="20"/>
               </w:rPr>
-              <w:t xml:space="preserve">💡 The Strategic Next Step
+              <w:t xml:space="preserve">💡 A Grounded Approach to Growth
 </w:t>
             </w:r>
             <w:r>
@@ -195,7 +197,7 @@
                 <w:sz w:val="19"/>
                 <w:szCs w:val="19"/>
               </w:rPr>
-              <w:t xml:space="preserve">Our website is already live and trusted by customers. The 4 expansion phases below transform it into our complete in-house business engine—connecting our warehouse, cold stores, van drivers, and office without paying huge software subscription fees.</w:t>
+              <w:t xml:space="preserve">As a focused distributor in Bahrain, we do not need complex, expensive corporate software. Instead, we can gradually add useful features to our existing platform over time—only moving forward when the business needs it and the team is comfortable.</w:t>
             </w:r>
           </w:p>
         </w:tc>
@@ -228,11 +230,13 @@
       </w:r>
       <w:r>
         <w:rPr>
+          <w:b/>
+          <w:bCs/>
           <w:color w:val="059669"/>
           <w:sz w:val="18"/>
           <w:szCs w:val="18"/>
         </w:rPr>
-        <w:t xml:space="preserve">   [Slide 2 of 6]</w:t>
+        <w:t xml:space="preserve">   [Phase 1 • Page 2 of 6]</w:t>
       </w:r>
     </w:p>
     <w:p>
@@ -245,7 +249,7 @@
           <w:sz w:val="18"/>
           <w:szCs w:val="18"/>
         </w:rPr>
-        <w:t xml:space="preserve">Kingdom of Bahrain FMCG Distribution &amp; Alsi Cola Sole Franchisee</w:t>
+        <w:t xml:space="preserve">Kingdom of Bahrain FMCG Distribution &amp; Beverage Showcase</w:t>
       </w:r>
     </w:p>
     <w:p>
@@ -261,7 +265,7 @@
           <w:sz w:val="28"/>
           <w:szCs w:val="28"/>
         </w:rPr>
-        <w:t xml:space="preserve">Phase 1: Customer Accounts &amp; Live Order Tracking</w:t>
+        <w:t xml:space="preserve">Phase 1: Customer Accounts &amp; Order Tracking</w:t>
       </w:r>
     </w:p>
     <w:p>
@@ -274,7 +278,7 @@
           <w:sz w:val="20"/>
           <w:szCs w:val="20"/>
         </w:rPr>
-        <w:t xml:space="preserve">Target: Month 1 (30 Days) — Giving our shoppers a modern Talabat/Amazon delivery experience.</w:t>
+        <w:t xml:space="preserve">A simple upgrade to give shoppers order history and clear delivery progress.</w:t>
       </w:r>
     </w:p>
     <w:p>
@@ -298,31 +302,31 @@
           <w:sz w:val="20"/>
           <w:szCs w:val="20"/>
         </w:rPr>
-        <w:t xml:space="preserve">1. Simple Mobile Login: </w:t>
-      </w:r>
-      <w:r>
-        <w:rPr>
-          <w:sz w:val="20"/>
-          <w:szCs w:val="20"/>
-        </w:rPr>
-        <w:t xml:space="preserve">Log in with Bahrain mobile phone number and a quick SMS code. No forgotten passwords.
-</w:t>
-      </w:r>
-      <w:r>
-        <w:rPr>
-          <w:b/>
-          <w:bCs/>
-          <w:sz w:val="20"/>
-          <w:szCs w:val="20"/>
-        </w:rPr>
-        <w:t xml:space="preserve">2. Saved Delivery Addresses: </w:t>
-      </w:r>
-      <w:r>
-        <w:rPr>
-          <w:sz w:val="20"/>
-          <w:szCs w:val="20"/>
-        </w:rPr>
-        <w:t xml:space="preserve">Save home or office addresses with Bahrain Governorate, Block, Road, and House number for 10-second reorders.
+        <w:t xml:space="preserve">1. Quick Mobile Login: </w:t>
+      </w:r>
+      <w:r>
+        <w:rPr>
+          <w:sz w:val="20"/>
+          <w:szCs w:val="20"/>
+        </w:rPr>
+        <w:t xml:space="preserve">Customers sign in with their Bahrain mobile number and a fast SMS code. No passwords to forget.
+</w:t>
+      </w:r>
+      <w:r>
+        <w:rPr>
+          <w:b/>
+          <w:bCs/>
+          <w:sz w:val="20"/>
+          <w:szCs w:val="20"/>
+        </w:rPr>
+        <w:t xml:space="preserve">2. Saved Bahrain Addresses: </w:t>
+      </w:r>
+      <w:r>
+        <w:rPr>
+          <w:sz w:val="20"/>
+          <w:szCs w:val="20"/>
+        </w:rPr>
+        <w:t xml:space="preserve">Save home or office addresses (Governorate, Block, Road, Building) for easy repeat ordering in seconds.
 </w:t>
       </w:r>
       <w:r>
@@ -343,7 +347,7 @@
           <w:sz w:val="20"/>
           <w:szCs w:val="20"/>
         </w:rPr>
-        <w:t xml:space="preserve">   [1. Received] ➔ [2. Confirmed] ➔ [3. Packed at Hidd] ➔ [4. In Delivery Van] ➔ [5. At Your Door]
+        <w:t xml:space="preserve">   [1. Received] ➔ [2. Confirmed] ➔ [3. Packed at Hidd] ➔ [4. In Van] ➔ [5. At Your Door]
 </w:t>
       </w:r>
       <w:r>
@@ -399,7 +403,7 @@
                 <w:sz w:val="20"/>
                 <w:szCs w:val="20"/>
               </w:rPr>
-              <w:t xml:space="preserve">💡 Why this matters for DAS Bahrain
+              <w:t xml:space="preserve">💡 Why this helps our daily work
 </w:t>
             </w:r>
             <w:r>
@@ -408,7 +412,7 @@
                 <w:sz w:val="19"/>
                 <w:szCs w:val="19"/>
               </w:rPr>
-              <w:t xml:space="preserve">Customers stop calling our phones asking 'where is my drink?'. They track their delivery in real-time on their phone, boosting repeat orders and loyalty for Alsi Cola.</w:t>
+              <w:t xml:space="preserve">Customers can see their delivery status directly on their phone. This cuts down phone inquiries asking 'where is my order?' and encourages repeat orders.</w:t>
             </w:r>
           </w:p>
         </w:tc>
@@ -441,11 +445,13 @@
       </w:r>
       <w:r>
         <w:rPr>
+          <w:b/>
+          <w:bCs/>
           <w:color w:val="059669"/>
           <w:sz w:val="18"/>
           <w:szCs w:val="18"/>
         </w:rPr>
-        <w:t xml:space="preserve">   [Slide 3 of 6]</w:t>
+        <w:t xml:space="preserve">   [Phase 2 • Page 3 of 6]</w:t>
       </w:r>
     </w:p>
     <w:p>
@@ -458,7 +464,7 @@
           <w:sz w:val="18"/>
           <w:szCs w:val="18"/>
         </w:rPr>
-        <w:t xml:space="preserve">Kingdom of Bahrain FMCG Distribution &amp; Alsi Cola Sole Franchisee</w:t>
+        <w:t xml:space="preserve">Kingdom of Bahrain FMCG Distribution &amp; Beverage Showcase</w:t>
       </w:r>
     </w:p>
     <w:p>
@@ -474,7 +480,7 @@
           <w:sz w:val="28"/>
           <w:szCs w:val="28"/>
         </w:rPr>
-        <w:t xml:space="preserve">Phase 2: Cold Store Portal &amp; Van Driver Mobile Manifest</w:t>
+        <w:t xml:space="preserve">Phase 2: Cold Store Portal &amp; Driver Stop List</w:t>
       </w:r>
     </w:p>
     <w:p>
@@ -487,7 +493,7 @@
           <w:sz w:val="20"/>
           <w:szCs w:val="20"/>
         </w:rPr>
-        <w:t xml:space="preserve">Target: Month 2 (35 Days) — Equipping neighborhood baqalas and van drivers.</w:t>
+        <w:t xml:space="preserve">Let regular baqalas place orders directly, and give drivers a clean stop checklist on their phone.</w:t>
       </w:r>
     </w:p>
     <w:p>
@@ -518,58 +524,58 @@
           <w:sz w:val="20"/>
           <w:szCs w:val="20"/>
         </w:rPr>
-        <w:t xml:space="preserve">Cold stores enter their Bahrain Commercial Registration (CR) once and unlock special wholesale carton rates.
-</w:t>
-      </w:r>
-      <w:r>
-        <w:rPr>
-          <w:b/>
-          <w:bCs/>
-          <w:sz w:val="20"/>
-          <w:szCs w:val="20"/>
-        </w:rPr>
-        <w:t xml:space="preserve">2. 24/7 Night-Time Reordering: </w:t>
-      </w:r>
-      <w:r>
-        <w:rPr>
-          <w:sz w:val="20"/>
-          <w:szCs w:val="20"/>
-        </w:rPr>
-        <w:t xml:space="preserve">Grocers can order 10 cases of Alsi Cola or Code Red at 11 PM directly from their phone when counting evening stock.
-</w:t>
-      </w:r>
-      <w:r>
-        <w:rPr>
-          <w:b/>
-          <w:bCs/>
-          <w:sz w:val="20"/>
-          <w:szCs w:val="20"/>
-        </w:rPr>
-        <w:t xml:space="preserve">3. Van Driver Mobile App (/driver): </w:t>
-      </w:r>
-      <w:r>
-        <w:rPr>
-          <w:sz w:val="20"/>
-          <w:szCs w:val="20"/>
-        </w:rPr>
-        <w:t xml:space="preserve">Drivers open a simple webpage on their phones showing their assigned stops for the day with Google Maps navigation.
-</w:t>
-      </w:r>
-      <w:r>
-        <w:rPr>
-          <w:b/>
-          <w:bCs/>
-          <w:sz w:val="20"/>
-          <w:szCs w:val="20"/>
-        </w:rPr>
-        <w:t xml:space="preserve">4. Digital Delivery Sign-Off: </w:t>
-      </w:r>
-      <w:r>
-        <w:rPr>
-          <w:sz w:val="20"/>
-          <w:szCs w:val="20"/>
-        </w:rPr>
-        <w:t xml:space="preserve">Store owner signs right on the driver's phone screen, instantly generating an electronic delivery note.
+        <w:t xml:space="preserve">Partner cold stores enter their CR number once and unlock special wholesale carton rates, reordering at their own convenience.
+</w:t>
+      </w:r>
+      <w:r>
+        <w:rPr>
+          <w:b/>
+          <w:bCs/>
+          <w:sz w:val="20"/>
+          <w:szCs w:val="20"/>
+        </w:rPr>
+        <w:t xml:space="preserve">2. Driver Web Page (/driver): </w:t>
+      </w:r>
+      <w:r>
+        <w:rPr>
+          <w:sz w:val="20"/>
+          <w:szCs w:val="20"/>
+        </w:rPr>
+        <w:t xml:space="preserve">Drivers open a clean mobile page on their phone showing their 10–15 daily delivery stops with store names and carton counts.
+</w:t>
+      </w:r>
+      <w:r>
+        <w:rPr>
+          <w:b/>
+          <w:bCs/>
+          <w:sz w:val="20"/>
+          <w:szCs w:val="20"/>
+        </w:rPr>
+        <w:t xml:space="preserve">3. Clean Delivery Routing: </w:t>
+      </w:r>
+      <w:r>
+        <w:rPr>
+          <w:sz w:val="20"/>
+          <w:szCs w:val="20"/>
+        </w:rPr>
+        <w:t xml:space="preserve">Stops organized cleanly across Muharraq, Manama, and Riffa with direct phone calling for store owners.
+</w:t>
+      </w:r>
+      <w:r>
+        <w:rPr>
+          <w:b/>
+          <w:bCs/>
+          <w:sz w:val="20"/>
+          <w:szCs w:val="20"/>
+        </w:rPr>
+        <w:t xml:space="preserve">4. Digital Delivery Confirmation: </w:t>
+      </w:r>
+      <w:r>
+        <w:rPr>
+          <w:sz w:val="20"/>
+          <w:szCs w:val="20"/>
+        </w:rPr>
+        <w:t xml:space="preserve">Store owner confirms delivery with a quick tap, generating an instant electronic proof of drop-off.
 </w:t>
       </w:r>
     </w:p>
@@ -608,7 +614,7 @@
                 <w:sz w:val="20"/>
                 <w:szCs w:val="20"/>
               </w:rPr>
-              <w:t xml:space="preserve">💡 Why this matters for DAS Bahrain
+              <w:t xml:space="preserve">💡 Why this helps our daily work
 </w:t>
             </w:r>
             <w:r>
@@ -617,7 +623,7 @@
                 <w:sz w:val="19"/>
                 <w:szCs w:val="19"/>
               </w:rPr>
-              <w:t xml:space="preserve">Eliminates lost paper delivery notes and phone tag. Baqalas order directly, and drivers know their exact route and carton counts before leaving the warehouse.</w:t>
+              <w:t xml:space="preserve">Replaces lost paper notes and disorganized WhatsApp chats. The driver knows exactly what needs to be delivered, and cold stores can request stock whenever they run low.</w:t>
             </w:r>
           </w:p>
         </w:tc>
@@ -650,11 +656,13 @@
       </w:r>
       <w:r>
         <w:rPr>
+          <w:b/>
+          <w:bCs/>
           <w:color w:val="059669"/>
           <w:sz w:val="18"/>
           <w:szCs w:val="18"/>
         </w:rPr>
-        <w:t xml:space="preserve">   [Slide 4 of 6]</w:t>
+        <w:t xml:space="preserve">   [Phase 3 • Page 4 of 6]</w:t>
       </w:r>
     </w:p>
     <w:p>
@@ -667,7 +675,7 @@
           <w:sz w:val="18"/>
           <w:szCs w:val="18"/>
         </w:rPr>
-        <w:t xml:space="preserve">Kingdom of Bahrain FMCG Distribution &amp; Alsi Cola Sole Franchisee</w:t>
+        <w:t xml:space="preserve">Kingdom of Bahrain FMCG Distribution &amp; Beverage Showcase</w:t>
       </w:r>
     </w:p>
     <w:p>
@@ -683,7 +691,7 @@
           <w:sz w:val="28"/>
           <w:szCs w:val="28"/>
         </w:rPr>
-        <w:t xml:space="preserve">Phase 3: Van Sales Quotas &amp; 100% Cash Settlement</w:t>
+        <w:t xml:space="preserve">Phase 3: Daily Stock &amp; Cash Reconciliation</w:t>
       </w:r>
     </w:p>
     <w:p>
@@ -696,7 +704,7 @@
           <w:sz w:val="20"/>
           <w:szCs w:val="20"/>
         </w:rPr>
-        <w:t xml:space="preserve">Target: Month 3 (30 Days) — Zero stock shrinkage and complete revenue protection.</w:t>
+        <w:t xml:space="preserve">Simple, foolproof checks when vans return to the warehouse at the end of the shift.</w:t>
       </w:r>
     </w:p>
     <w:p>
@@ -720,24 +728,24 @@
           <w:sz w:val="20"/>
           <w:szCs w:val="20"/>
         </w:rPr>
-        <w:t xml:space="preserve">1. Daily Carton Sales Targets: </w:t>
-      </w:r>
-      <w:r>
-        <w:rPr>
-          <w:sz w:val="20"/>
-          <w:szCs w:val="20"/>
-        </w:rPr>
-        <w:t xml:space="preserve">Set daily carton quotas per van (e.g. 100 cases of Alsi Cola/day). Supervisors see live targets vs. actuals.
-</w:t>
-      </w:r>
-      <w:r>
-        <w:rPr>
-          <w:b/>
-          <w:bCs/>
-          <w:sz w:val="20"/>
-          <w:szCs w:val="20"/>
-        </w:rPr>
-        <w:t xml:space="preserve">2. 6:00 PM End-of-Shift Cash Audit:
+        <w:t xml:space="preserve">1. Morning vs. Evening Counts: </w:t>
+      </w:r>
+      <w:r>
+        <w:rPr>
+          <w:sz w:val="20"/>
+          <w:szCs w:val="20"/>
+        </w:rPr>
+        <w:t xml:space="preserve">Quickly record how many cartons left the warehouse in the morning and how many returned in the evening.
+</w:t>
+      </w:r>
+      <w:r>
+        <w:rPr>
+          <w:b/>
+          <w:bCs/>
+          <w:sz w:val="20"/>
+          <w:szCs w:val="20"/>
+        </w:rPr>
+        <w:t xml:space="preserve">2. Cash &amp; BenefitPay Settlement:
 </w:t>
       </w:r>
       <w:r>
@@ -745,10 +753,10 @@
           <w:sz w:val="19"/>
           <w:szCs w:val="19"/>
         </w:rPr>
-        <w:t xml:space="preserve">   • Morning Van Load-out: 120 Cartons
-   • Evening Returns: 18 Cartons
-   • Verified Sold: 102 Cartons
-   • Money Collected: Cash + BenefitPay receipts MUST equal 102 cartons.
+        <w:t xml:space="preserve">   • Morning Load-Out: 100 Cartons
+   • Evening Returns: 15 Cartons
+   • Verified Sold: 85 Cartons
+   • Cash Collected + BenefitPay Receipts = Exactly 85 Cartons balanced.
 </w:t>
       </w:r>
       <w:r>
@@ -765,7 +773,7 @@
           <w:sz w:val="20"/>
           <w:szCs w:val="20"/>
         </w:rPr>
-        <w:t xml:space="preserve">Sales commissions calculate automatically from verified delivery logs, motivating drivers to beat their targets.
+        <w:t xml:space="preserve">Optional commission ledger calculating daily incentives for drivers who hit sales milestones.
 </w:t>
       </w:r>
     </w:p>
@@ -804,7 +812,7 @@
                 <w:sz w:val="20"/>
                 <w:szCs w:val="20"/>
               </w:rPr>
-              <w:t xml:space="preserve">💡 Why this matters for DAS Bahrain
+              <w:t xml:space="preserve">💡 Why this helps our daily work
 </w:t>
             </w:r>
             <w:r>
@@ -813,7 +821,7 @@
                 <w:sz w:val="19"/>
                 <w:szCs w:val="19"/>
               </w:rPr>
-              <w:t xml:space="preserve">Every single can of drink and every fils of revenue is accounted for before drivers leave the depot. No missing stock, no uncollected cash.</w:t>
+              <w:t xml:space="preserve">Gives management complete clarity that every carton of Alsi Cola is accounted for before drivers wrap up their day. No missing inventory, no cash shortfalls.</w:t>
             </w:r>
           </w:p>
         </w:tc>
@@ -846,11 +854,13 @@
       </w:r>
       <w:r>
         <w:rPr>
+          <w:b/>
+          <w:bCs/>
           <w:color w:val="059669"/>
           <w:sz w:val="18"/>
           <w:szCs w:val="18"/>
         </w:rPr>
-        <w:t xml:space="preserve">   [Slide 5 of 6]</w:t>
+        <w:t xml:space="preserve">   [Phase 4 • Page 5 of 6]</w:t>
       </w:r>
     </w:p>
     <w:p>
@@ -863,7 +873,7 @@
           <w:sz w:val="18"/>
           <w:szCs w:val="18"/>
         </w:rPr>
-        <w:t xml:space="preserve">Kingdom of Bahrain FMCG Distribution &amp; Alsi Cola Sole Franchisee</w:t>
+        <w:t xml:space="preserve">Kingdom of Bahrain FMCG Distribution &amp; Beverage Showcase</w:t>
       </w:r>
     </w:p>
     <w:p>
@@ -879,7 +889,7 @@
           <w:sz w:val="28"/>
           <w:szCs w:val="28"/>
         </w:rPr>
-        <w:t xml:space="preserve">Phase 4: Staff Records, Bank Payroll &amp; 10% Bahrain VAT</w:t>
+        <w:t xml:space="preserve">Phase 4: Staff Records, Payroll &amp; 10% VAT</w:t>
       </w:r>
     </w:p>
     <w:p>
@@ -892,7 +902,7 @@
           <w:sz w:val="20"/>
           <w:szCs w:val="20"/>
         </w:rPr>
-        <w:t xml:space="preserve">Target: Month 4 (35 Days) — Effortless company administration and legal compliance.</w:t>
+        <w:t xml:space="preserve">Simple administrative automations introduced as the team and order volume expand.</w:t>
       </w:r>
     </w:p>
     <w:p>
@@ -916,14 +926,14 @@
           <w:sz w:val="20"/>
           <w:szCs w:val="20"/>
         </w:rPr>
-        <w:t xml:space="preserve">1. LMRA &amp; CPR Document Tracking: </w:t>
-      </w:r>
-      <w:r>
-        <w:rPr>
-          <w:sz w:val="20"/>
-          <w:szCs w:val="20"/>
-        </w:rPr>
-        <w:t xml:space="preserve">Staff CPR cards, driving licenses, and work visas stored with 60-day renewal warnings to avoid LMRA fines.
+        <w:t xml:space="preserve">1. CPR &amp; Visa Expiry Alerts: </w:t>
+      </w:r>
+      <w:r>
+        <w:rPr>
+          <w:sz w:val="20"/>
+          <w:szCs w:val="20"/>
+        </w:rPr>
+        <w:t xml:space="preserve">Tracks employee CPR, driving licenses, and LMRA work permits with 60-day renewal warnings to avoid fines.
 </w:t>
       </w:r>
       <w:r>
@@ -940,41 +950,41 @@
           <w:sz w:val="20"/>
           <w:szCs w:val="20"/>
         </w:rPr>
-        <w:t xml:space="preserve">Calculates base salary, overtime, commissions, and GOSI deductions—exports the exact Wages Protection System (WPS) file for NBB, BBK, Ila, or AUB.
-</w:t>
-      </w:r>
-      <w:r>
-        <w:rPr>
-          <w:b/>
-          <w:bCs/>
-          <w:sz w:val="20"/>
-          <w:szCs w:val="20"/>
-        </w:rPr>
-        <w:t xml:space="preserve">3. Automatic 10% Bahrain Tax Invoices: </w:t>
-      </w:r>
-      <w:r>
-        <w:rPr>
-          <w:sz w:val="20"/>
-          <w:szCs w:val="20"/>
-        </w:rPr>
-        <w:t xml:space="preserve">Every wholesale delivery generates a compliant tax invoice with DAS CR and VAT details.
-</w:t>
-      </w:r>
-      <w:r>
-        <w:rPr>
-          <w:b/>
-          <w:bCs/>
-          <w:sz w:val="20"/>
-          <w:szCs w:val="20"/>
-        </w:rPr>
-        <w:t xml:space="preserve">4. NBR Quarterly VAT Ledger: </w:t>
-      </w:r>
-      <w:r>
-        <w:rPr>
-          <w:sz w:val="20"/>
-          <w:szCs w:val="20"/>
-        </w:rPr>
-        <w:t xml:space="preserve">Summarizes Input VAT on inventory purchases vs. Output VAT on sales, making quarterly filing with NBR take 5 minutes.
+        <w:t xml:space="preserve">Exports the exact Wages Protection System (SIF) file required by Bahrain banks (NBB, BBK, Ila, AUB) for monthly salaries.
+</w:t>
+      </w:r>
+      <w:r>
+        <w:rPr>
+          <w:b/>
+          <w:bCs/>
+          <w:sz w:val="20"/>
+          <w:szCs w:val="20"/>
+        </w:rPr>
+        <w:t xml:space="preserve">3. Automatic 10% Tax Invoices: </w:t>
+      </w:r>
+      <w:r>
+        <w:rPr>
+          <w:sz w:val="20"/>
+          <w:szCs w:val="20"/>
+        </w:rPr>
+        <w:t xml:space="preserve">Generates compliant Bahrain tax receipts for cold stores showing DAS CR and VAT numbers automatically.
+</w:t>
+      </w:r>
+      <w:r>
+        <w:rPr>
+          <w:b/>
+          <w:bCs/>
+          <w:sz w:val="20"/>
+          <w:szCs w:val="20"/>
+        </w:rPr>
+        <w:t xml:space="preserve">4. 5-Minute NBR VAT Filing: </w:t>
+      </w:r>
+      <w:r>
+        <w:rPr>
+          <w:sz w:val="20"/>
+          <w:szCs w:val="20"/>
+        </w:rPr>
+        <w:t xml:space="preserve">Summarizes Input VAT on stock purchases vs. Output VAT on drink sales for effortless quarterly filing.
 </w:t>
       </w:r>
     </w:p>
@@ -1013,7 +1023,7 @@
                 <w:sz w:val="20"/>
                 <w:szCs w:val="20"/>
               </w:rPr>
-              <w:t xml:space="preserve">💡 Why this matters for DAS Bahrain
+              <w:t xml:space="preserve">💡 Why this helps our daily work
 </w:t>
             </w:r>
             <w:r>
@@ -1022,7 +1032,7 @@
                 <w:sz w:val="19"/>
                 <w:szCs w:val="19"/>
               </w:rPr>
-              <w:t xml:space="preserve">Keeps DAS Bahrain 100% compliant with the Ministry of Labour, LMRA, Central Bank WPS, and NBR tax authorities without paying expensive external consultants.</w:t>
+              <w:t xml:space="preserve">Keeps DAS Bahrain in full compliance with LMRA, Ministry of Labour WPS rules, and NBR VAT guidelines with minimal office overhead.</w:t>
             </w:r>
           </w:p>
         </w:tc>
@@ -1055,11 +1065,13 @@
       </w:r>
       <w:r>
         <w:rPr>
+          <w:b/>
+          <w:bCs/>
           <w:color w:val="059669"/>
           <w:sz w:val="18"/>
           <w:szCs w:val="18"/>
         </w:rPr>
-        <w:t xml:space="preserve">   [Slide 6 of 6]</w:t>
+        <w:t xml:space="preserve">   [Summary • Page 6 of 6]</w:t>
       </w:r>
     </w:p>
     <w:p>
@@ -1072,7 +1084,7 @@
           <w:sz w:val="18"/>
           <w:szCs w:val="18"/>
         </w:rPr>
-        <w:t xml:space="preserve">Kingdom of Bahrain FMCG Distribution &amp; Alsi Cola Sole Franchisee</w:t>
+        <w:t xml:space="preserve">Kingdom of Bahrain FMCG Distribution &amp; Beverage Showcase</w:t>
       </w:r>
     </w:p>
     <w:p>
@@ -1088,7 +1100,7 @@
           <w:sz w:val="28"/>
           <w:szCs w:val="28"/>
         </w:rPr>
-        <w:t xml:space="preserve">The Bottom Line &amp; Clearance Request</w:t>
+        <w:t xml:space="preserve">The Bottom Line: A Practical, Low-Risk Path Forward</w:t>
       </w:r>
     </w:p>
     <w:p>
@@ -1101,12 +1113,12 @@
           <w:sz w:val="20"/>
           <w:szCs w:val="20"/>
         </w:rPr>
-        <w:t xml:space="preserve">Summary Comparison &amp; Action Required from Leadership.</w:t>
-      </w:r>
-    </w:p>
-    <w:p>
-      <w:pPr>
-        <w:spacing w:after="100"/>
+        <w:t xml:space="preserve">Tailored specifically for our current size, with no rush and zero unnecessary software costs.</w:t>
+      </w:r>
+    </w:p>
+    <w:p>
+      <w:pPr>
+        <w:spacing w:after="120"/>
       </w:pPr>
       <w:r>
         <w:rPr>
@@ -1125,48 +1137,65 @@
           <w:sz w:val="20"/>
           <w:szCs w:val="20"/>
         </w:rPr>
-        <w:t xml:space="preserve">• Zero Software Tax: </w:t>
-      </w:r>
-      <w:r>
-        <w:rPr>
-          <w:sz w:val="20"/>
-          <w:szCs w:val="20"/>
-        </w:rPr>
-        <w:t xml:space="preserve">Saves 12,000 to 25,000 BHD every year in recurring ERP license fees (SAP/Oracle).
-</w:t>
-      </w:r>
-      <w:r>
-        <w:rPr>
-          <w:b/>
-          <w:bCs/>
-          <w:sz w:val="20"/>
-          <w:szCs w:val="20"/>
-        </w:rPr>
-        <w:t xml:space="preserve">• Tailored to Bahrain: </w:t>
-      </w:r>
-      <w:r>
-        <w:rPr>
-          <w:sz w:val="20"/>
-          <w:szCs w:val="20"/>
-        </w:rPr>
-        <w:t xml:space="preserve">Built specifically around local cold stores, van delivery routes, BenefitPay, and LMRA/WPS rules.
-</w:t>
-      </w:r>
-      <w:r>
-        <w:rPr>
-          <w:b/>
-          <w:bCs/>
-          <w:sz w:val="20"/>
-          <w:szCs w:val="20"/>
-        </w:rPr>
-        <w:t xml:space="preserve">• Zero Downtime: </w:t>
-      </w:r>
-      <w:r>
-        <w:rPr>
-          <w:sz w:val="20"/>
-          <w:szCs w:val="20"/>
-        </w:rPr>
-        <w:t xml:space="preserve">The current website stays live and unaffected throughout every step.
+        <w:t xml:space="preserve">• Spread Out at Our Own Pace: </w:t>
+      </w:r>
+      <w:r>
+        <w:rPr>
+          <w:sz w:val="20"/>
+          <w:szCs w:val="20"/>
+        </w:rPr>
+        <w:t xml:space="preserve">Each phase is completely independent. We only move to the next phase when the business demands it and the team is ready.
+</w:t>
+      </w:r>
+      <w:r>
+        <w:rPr>
+          <w:b/>
+          <w:bCs/>
+          <w:sz w:val="20"/>
+          <w:szCs w:val="20"/>
+        </w:rPr>
+        <w:t xml:space="preserve">• 0 BHD Monthly Software Fees: </w:t>
+      </w:r>
+      <w:r>
+        <w:rPr>
+          <w:sz w:val="20"/>
+          <w:szCs w:val="20"/>
+        </w:rPr>
+        <w:t xml:space="preserve">We avoid foreign software subscriptions (which cost 1,000+ BHD/month) by using our own lightweight web tools.
+</w:t>
+      </w:r>
+      <w:r>
+        <w:rPr>
+          <w:b/>
+          <w:bCs/>
+          <w:sz w:val="20"/>
+          <w:szCs w:val="20"/>
+        </w:rPr>
+        <w:t xml:space="preserve">• Zero Disruption to Customers: </w:t>
+      </w:r>
+      <w:r>
+        <w:rPr>
+          <w:sz w:val="20"/>
+          <w:szCs w:val="20"/>
+        </w:rPr>
+        <w:t xml:space="preserve">Our current website stays active 24/7. Shoppers and buyers can continue browsing and ordering without any interruption.
+</w:t>
+      </w:r>
+      <w:r>
+        <w:rPr>
+          <w:b/>
+          <w:bCs/>
+          <w:sz w:val="20"/>
+          <w:szCs w:val="20"/>
+        </w:rPr>
+        <w:t xml:space="preserve">• Tailored for Bahrain FMCG: </w:t>
+      </w:r>
+      <w:r>
+        <w:rPr>
+          <w:sz w:val="20"/>
+          <w:szCs w:val="20"/>
+        </w:rPr>
+        <w:t xml:space="preserve">Designed specifically around neighborhood cold stores, local van routes, BenefitPay, and Bahrain regulations.
 </w:t>
       </w:r>
     </w:p>
@@ -1202,37 +1231,19 @@
                 <w:b/>
                 <w:bCs/>
                 <w:color w:val="064E3B"/>
-                <w:sz w:val="22"/>
-                <w:szCs w:val="22"/>
+                <w:sz w:val="20"/>
+                <w:szCs w:val="20"/>
               </w:rPr>
-              <w:t xml:space="preserve">REQUEST FOR MANAGEMENT CLEARANCE: START PHASE 1
+              <w:t xml:space="preserve">💡 Next Step for Discussion
 </w:t>
             </w:r>
             <w:r>
               <w:rPr>
+                <w:color w:val="15803D"/>
                 <w:sz w:val="19"/>
                 <w:szCs w:val="19"/>
               </w:rPr>
-              <w:t xml:space="preserve">We are ready to begin Phase 1 (Customer Login &amp; Order Tracking). We request formal stakeholder clearance to start database setup.
-</w:t>
-            </w:r>
-            <w:r>
-              <w:rPr>
-                <w:b/>
-                <w:bCs/>
-                <w:sz w:val="18"/>
-                <w:szCs w:val="18"/>
-              </w:rPr>
-              <w:t xml:space="preserve">Approved By: _____________________________              Date: _____________________
-</w:t>
-            </w:r>
-            <w:r>
-              <w:rPr>
-                <w:color w:val="64748B"/>
-                <w:sz w:val="16"/>
-                <w:szCs w:val="16"/>
-              </w:rPr>
-              <w:t xml:space="preserve">Bejoy Joseph (Managing Director, DAS Bahrain)             Board of Directors / Stakeholders</w:t>
+              <w:t xml:space="preserve">When the team is ready, we can explore starting with Phase 1 (Customer Accounts &amp; Order Status) as a quiet, gradual upgrade. In the meantime, our current live website continues to serve customers and take wholesale inquiries across Bahrain smoothly.</w:t>
             </w:r>
           </w:p>
         </w:tc>

</xml_diff>

<commit_message>
docs: rewrite expansion plan with cloud database & backend admin portal focus, practical adoption-first narrative
</commit_message>
<xml_diff>
--- a/docs/DAS_Bahrain_Expansion_Plan.docx
+++ b/docs/DAS_Bahrain_Expansion_Plan.docx
@@ -5,7 +5,6 @@
     <w:p>
       <w:pPr>
         <w:spacing w:after="40" w:before="100"/>
-        <w:jc w:val="left"/>
       </w:pPr>
       <w:r>
         <w:rPr>
@@ -25,7 +24,7 @@
           <w:sz w:val="18"/>
           <w:szCs w:val="18"/>
         </w:rPr>
-        <w:t xml:space="preserve">   [Current Foundation • Page 1 of 6]</w:t>
+        <w:t xml:space="preserve">   [Core Strategy • Page 1 of 6]</w:t>
       </w:r>
     </w:p>
     <w:p>
@@ -38,7 +37,7 @@
           <w:sz w:val="18"/>
           <w:szCs w:val="18"/>
         </w:rPr>
-        <w:t xml:space="preserve">Kingdom of Bahrain FMCG Distribution &amp; Beverage Showcase</w:t>
+        <w:t xml:space="preserve">Kingdom of Bahrain FMCG Distribution</w:t>
       </w:r>
     </w:p>
     <w:p>
@@ -54,7 +53,7 @@
           <w:sz w:val="28"/>
           <w:szCs w:val="28"/>
         </w:rPr>
-        <w:t xml:space="preserve">Where We Stand Today: Current Website &amp; Foundation</w:t>
+        <w:t xml:space="preserve">Powering Our Daily Work (Without Disruption)</w:t>
       </w:r>
     </w:p>
     <w:p>
@@ -67,7 +66,7 @@
           <w:sz w:val="20"/>
           <w:szCs w:val="20"/>
         </w:rPr>
-        <w:t xml:space="preserve">Our public web presence is already live, fast, and handling everyday customer inquiries across Bahrain.</w:t>
+        <w:t xml:space="preserve">Rather than altering how DAS Bahrain operates today, we connect a secure cloud database and backend admin portal to our live website—making everyday order handling faster, easier, and error-free.</w:t>
       </w:r>
     </w:p>
     <w:p>
@@ -81,75 +80,75 @@
           <w:sz w:val="22"/>
           <w:szCs w:val="22"/>
         </w:rPr>
-        <w:t xml:space="preserve">Current Live Assets on our Website:
-</w:t>
-      </w:r>
-      <w:r>
-        <w:rPr>
-          <w:b/>
-          <w:bCs/>
-          <w:sz w:val="20"/>
-          <w:szCs w:val="20"/>
-        </w:rPr>
-        <w:t xml:space="preserve">• Flagship FMCG &amp; Alsi Cola: </w:t>
-      </w:r>
-      <w:r>
-        <w:rPr>
-          <w:sz w:val="20"/>
-          <w:szCs w:val="20"/>
-        </w:rPr>
-        <w:t xml:space="preserve">Showcases our key beverage lines (Alsi Cola Original &amp; Diet, Code Red, fruit juices) alongside groceries and hygiene supplies.
-</w:t>
-      </w:r>
-      <w:r>
-        <w:rPr>
-          <w:b/>
-          <w:bCs/>
-          <w:sz w:val="20"/>
-          <w:szCs w:val="20"/>
-        </w:rPr>
-        <w:t xml:space="preserve">• Carton vs. Single Unit Switch: </w:t>
-      </w:r>
-      <w:r>
-        <w:rPr>
-          <w:sz w:val="20"/>
-          <w:szCs w:val="20"/>
-        </w:rPr>
-        <w:t xml:space="preserve">Customers and cold store buyers can toggle between individual cans and wholesale carton rates instantly.
-</w:t>
-      </w:r>
-      <w:r>
-        <w:rPr>
-          <w:b/>
-          <w:bCs/>
-          <w:sz w:val="20"/>
-          <w:szCs w:val="20"/>
-        </w:rPr>
-        <w:t xml:space="preserve">• BenefitPay &amp; WhatsApp Orders: </w:t>
-      </w:r>
-      <w:r>
-        <w:rPr>
-          <w:sz w:val="20"/>
-          <w:szCs w:val="20"/>
-        </w:rPr>
-        <w:t xml:space="preserve">Matches local Bahrain habits: quick BenefitPay QR payments and direct WhatsApp messaging for orders.
-</w:t>
-      </w:r>
-      <w:r>
-        <w:rPr>
-          <w:b/>
-          <w:bCs/>
-          <w:sz w:val="20"/>
-          <w:szCs w:val="20"/>
-        </w:rPr>
-        <w:t xml:space="preserve">• Mobile &amp; Arabic Friendly: </w:t>
-      </w:r>
-      <w:r>
-        <w:rPr>
-          <w:sz w:val="20"/>
-          <w:szCs w:val="20"/>
-        </w:rPr>
-        <w:t xml:space="preserve">Fast and readable on smartphones, with an instant English/Arabic language toggle for local grocers.
+        <w:t xml:space="preserve">What We Already Have &amp; What We Are Adding:
+</w:t>
+      </w:r>
+      <w:r>
+        <w:rPr>
+          <w:b/>
+          <w:bCs/>
+          <w:sz w:val="20"/>
+          <w:szCs w:val="20"/>
+        </w:rPr>
+        <w:t xml:space="preserve">• Our Live Storefront: </w:t>
+      </w:r>
+      <w:r>
+        <w:rPr>
+          <w:sz w:val="20"/>
+          <w:szCs w:val="20"/>
+        </w:rPr>
+        <w:t xml:space="preserve">Already showcases Alsi Cola, energy drinks, and food items with carton/unit toggles and BenefitPay. Gives customers a credible direct channel.
+</w:t>
+      </w:r>
+      <w:r>
+        <w:rPr>
+          <w:b/>
+          <w:bCs/>
+          <w:sz w:val="20"/>
+          <w:szCs w:val="20"/>
+        </w:rPr>
+        <w:t xml:space="preserve">• The Missing Link — Cloud Database: </w:t>
+      </w:r>
+      <w:r>
+        <w:rPr>
+          <w:sz w:val="20"/>
+          <w:szCs w:val="20"/>
+        </w:rPr>
+        <w:t xml:space="preserve">By connecting a lightweight cloud database (hosted securely on Google Cloud or AWS), every order, inquiry, and customer contact is saved instantly and securely.
+</w:t>
+      </w:r>
+      <w:r>
+        <w:rPr>
+          <w:b/>
+          <w:bCs/>
+          <w:sz w:val="20"/>
+          <w:szCs w:val="20"/>
+        </w:rPr>
+        <w:t xml:space="preserve">• Backend Admin Portal: </w:t>
+      </w:r>
+      <w:r>
+        <w:rPr>
+          <w:sz w:val="20"/>
+          <w:szCs w:val="20"/>
+        </w:rPr>
+        <w:t xml:space="preserve">A password-protected screen where our staff manages orders, edits stock, and updates prices in seconds from any laptop or mobile phone.
+</w:t>
+      </w:r>
+      <w:r>
+        <w:rPr>
+          <w:b/>
+          <w:bCs/>
+          <w:sz w:val="20"/>
+          <w:szCs w:val="20"/>
+        </w:rPr>
+        <w:t xml:space="preserve">• Marketing &amp; Phased Growth: </w:t>
+      </w:r>
+      <w:r>
+        <w:rPr>
+          <w:sz w:val="20"/>
+          <w:szCs w:val="20"/>
+        </w:rPr>
+        <w:t xml:space="preserve">Once the team is comfortable using the backend daily, we can roll out customer tracking, cold store wholesale logins, and van tools as we expand.
 </w:t>
       </w:r>
     </w:p>
@@ -188,7 +187,7 @@
                 <w:sz w:val="20"/>
                 <w:szCs w:val="20"/>
               </w:rPr>
-              <w:t xml:space="preserve">💡 A Grounded Approach to Growth
+              <w:t xml:space="preserve">Guiding Principle
 </w:t>
             </w:r>
             <w:r>
@@ -197,7 +196,7 @@
                 <w:sz w:val="19"/>
                 <w:szCs w:val="19"/>
               </w:rPr>
-              <w:t xml:space="preserve">As a focused distributor in Bahrain, we do not need complex, expensive corporate software. Instead, we can gradually add useful features to our existing platform over time—only moving forward when the business needs it and the team is comfortable.</w:t>
+              <w:t xml:space="preserve">Zero disruption to our current sales routine. We start by using the website as a practical daily tool for our staff, then expand features as our order volume grows.</w:t>
             </w:r>
           </w:p>
         </w:tc>
@@ -216,7 +215,6 @@
     <w:p>
       <w:pPr>
         <w:spacing w:after="40" w:before="100"/>
-        <w:jc w:val="left"/>
       </w:pPr>
       <w:r>
         <w:rPr>
@@ -236,7 +234,7 @@
           <w:sz w:val="18"/>
           <w:szCs w:val="18"/>
         </w:rPr>
-        <w:t xml:space="preserve">   [Phase 1 • Page 2 of 6]</w:t>
+        <w:t xml:space="preserve">   [Architecture • Page 2 of 6]</w:t>
       </w:r>
     </w:p>
     <w:p>
@@ -249,7 +247,7 @@
           <w:sz w:val="18"/>
           <w:szCs w:val="18"/>
         </w:rPr>
-        <w:t xml:space="preserve">Kingdom of Bahrain FMCG Distribution &amp; Beverage Showcase</w:t>
+        <w:t xml:space="preserve">Kingdom of Bahrain FMCG Distribution</w:t>
       </w:r>
     </w:p>
     <w:p>
@@ -265,7 +263,7 @@
           <w:sz w:val="28"/>
           <w:szCs w:val="28"/>
         </w:rPr>
-        <w:t xml:space="preserve">Phase 1: Customer Accounts &amp; Order Tracking</w:t>
+        <w:t xml:space="preserve">The Customer Storefront + The Employee Portal</w:t>
       </w:r>
     </w:p>
     <w:p>
@@ -278,7 +276,7 @@
           <w:sz w:val="20"/>
           <w:szCs w:val="20"/>
         </w:rPr>
-        <w:t xml:space="preserve">A simple upgrade to give shoppers order history and clear delivery progress.</w:t>
+        <w:t xml:space="preserve">One unified platform powered by a secure cloud database, serving both our buyers and our office team.</w:t>
       </w:r>
     </w:p>
     <w:p>
@@ -292,80 +290,91 @@
           <w:sz w:val="22"/>
           <w:szCs w:val="22"/>
         </w:rPr>
-        <w:t xml:space="preserve">What Customers Will Experience:
-</w:t>
-      </w:r>
-      <w:r>
-        <w:rPr>
-          <w:b/>
-          <w:bCs/>
-          <w:sz w:val="20"/>
-          <w:szCs w:val="20"/>
-        </w:rPr>
-        <w:t xml:space="preserve">1. Quick Mobile Login: </w:t>
-      </w:r>
-      <w:r>
-        <w:rPr>
-          <w:sz w:val="20"/>
-          <w:szCs w:val="20"/>
-        </w:rPr>
-        <w:t xml:space="preserve">Customers sign in with their Bahrain mobile number and a fast SMS code. No passwords to forget.
-</w:t>
-      </w:r>
-      <w:r>
-        <w:rPr>
-          <w:b/>
-          <w:bCs/>
-          <w:sz w:val="20"/>
-          <w:szCs w:val="20"/>
-        </w:rPr>
-        <w:t xml:space="preserve">2. Saved Bahrain Addresses: </w:t>
-      </w:r>
-      <w:r>
-        <w:rPr>
-          <w:sz w:val="20"/>
-          <w:szCs w:val="20"/>
-        </w:rPr>
-        <w:t xml:space="preserve">Save home or office addresses (Governorate, Block, Road, Building) for easy repeat ordering in seconds.
-</w:t>
-      </w:r>
-      <w:r>
-        <w:rPr>
-          <w:b/>
-          <w:bCs/>
-          <w:sz w:val="20"/>
-          <w:szCs w:val="20"/>
-        </w:rPr>
-        <w:t xml:space="preserve">3. Live 5-Stage Delivery Pipeline:
-</w:t>
-      </w:r>
-      <w:r>
-        <w:rPr>
-          <w:b/>
-          <w:bCs/>
+        <w:t xml:space="preserve">Side A: Customer-Facing Storefront
+</w:t>
+      </w:r>
+      <w:r>
+        <w:rPr>
+          <w:b/>
+          <w:bCs/>
+          <w:sz w:val="20"/>
+          <w:szCs w:val="20"/>
+        </w:rPr>
+        <w:t xml:space="preserve">Who uses it: </w:t>
+      </w:r>
+      <w:r>
+        <w:rPr>
+          <w:sz w:val="20"/>
+          <w:szCs w:val="20"/>
+        </w:rPr>
+        <w:t xml:space="preserve">Retail shoppers, families, offices, and cold stores.
+</w:t>
+      </w:r>
+      <w:r>
+        <w:rPr>
+          <w:sz w:val="20"/>
+          <w:szCs w:val="20"/>
+        </w:rPr>
+        <w:t xml:space="preserve">• Browse full beverage &amp; grocery catalogue.
+• Select single cans or wholesale cartons.
+• Place orders via BenefitPay QR &amp; WhatsApp.
+• Submit B2B wholesale inquiries across Bahrain.
+</w:t>
+      </w:r>
+      <w:r>
+        <w:rPr>
+          <w:b/>
+          <w:bCs/>
+          <w:sz w:val="22"/>
+          <w:szCs w:val="22"/>
+        </w:rPr>
+        <w:t xml:space="preserve">Side B: Backend Employee Portal
+</w:t>
+      </w:r>
+      <w:r>
+        <w:rPr>
+          <w:b/>
+          <w:bCs/>
+          <w:sz w:val="20"/>
+          <w:szCs w:val="20"/>
+        </w:rPr>
+        <w:t xml:space="preserve">Who uses it: </w:t>
+      </w:r>
+      <w:r>
+        <w:rPr>
+          <w:sz w:val="20"/>
+          <w:szCs w:val="20"/>
+        </w:rPr>
+        <w:t xml:space="preserve">DAS sales team, dispatchers, and management.
+</w:t>
+      </w:r>
+      <w:r>
+        <w:rPr>
+          <w:sz w:val="20"/>
+          <w:szCs w:val="20"/>
+        </w:rPr>
+        <w:t xml:space="preserve">• See incoming orders in one organized live list.
+• Update carton prices and mark items out-of-stock.
+• Access customer phone numbers and delivery addresses.
+• Export customer contacts for marketing and broadcasts.
+</w:t>
+      </w:r>
+      <w:r>
+        <w:rPr>
+          <w:b/>
+          <w:bCs/>
+          <w:sz w:val="20"/>
+          <w:szCs w:val="20"/>
+        </w:rPr>
+        <w:t xml:space="preserve">How it connects: </w:t>
+      </w:r>
+      <w:r>
+        <w:rPr>
           <w:color w:val="059669"/>
           <w:sz w:val="20"/>
           <w:szCs w:val="20"/>
         </w:rPr>
-        <w:t xml:space="preserve">   [1. Received] ➔ [2. Confirmed] ➔ [3. Packed at Hidd] ➔ [4. In Van] ➔ [5. At Your Door]
-</w:t>
-      </w:r>
-      <w:r>
-        <w:rPr>
-          <w:b/>
-          <w:bCs/>
-          <w:sz w:val="20"/>
-          <w:szCs w:val="20"/>
-        </w:rPr>
-        <w:t xml:space="preserve">4. One-Click Reordering: </w:t>
-      </w:r>
-      <w:r>
-        <w:rPr>
-          <w:sz w:val="20"/>
-          <w:szCs w:val="20"/>
-        </w:rPr>
-        <w:t xml:space="preserve">Past order receipts and instant re-order button for regular families and small offices.
-</w:t>
+        <w:t xml:space="preserve">[Public Website] &lt;--&gt; [Secure Cloud Database (PostgreSQL)] &lt;--&gt; [Employee Admin Portal]</w:t>
       </w:r>
     </w:p>
     <w:tbl>
@@ -403,7 +412,7 @@
                 <w:sz w:val="20"/>
                 <w:szCs w:val="20"/>
               </w:rPr>
-              <w:t xml:space="preserve">💡 Why this helps our daily work
+              <w:t xml:space="preserve">Direct Day-to-Day Benefit
 </w:t>
             </w:r>
             <w:r>
@@ -412,7 +421,7 @@
                 <w:sz w:val="19"/>
                 <w:szCs w:val="19"/>
               </w:rPr>
-              <w:t xml:space="preserve">Customers can see their delivery status directly on their phone. This cuts down phone inquiries asking 'where is my order?' and encourages repeat orders.</w:t>
+              <w:t xml:space="preserve">Our team no longer relies on scattered WhatsApp chats or scraps of paper. Orders and customer contacts automatically land in our private back-office screen.</w:t>
             </w:r>
           </w:p>
         </w:tc>
@@ -431,7 +440,6 @@
     <w:p>
       <w:pPr>
         <w:spacing w:after="40" w:before="100"/>
-        <w:jc w:val="left"/>
       </w:pPr>
       <w:r>
         <w:rPr>
@@ -451,7 +459,7 @@
           <w:sz w:val="18"/>
           <w:szCs w:val="18"/>
         </w:rPr>
-        <w:t xml:space="preserve">   [Phase 2 • Page 3 of 6]</w:t>
+        <w:t xml:space="preserve">   [Staff Benefits • Page 3 of 6]</w:t>
       </w:r>
     </w:p>
     <w:p>
@@ -464,7 +472,7 @@
           <w:sz w:val="18"/>
           <w:szCs w:val="18"/>
         </w:rPr>
-        <w:t xml:space="preserve">Kingdom of Bahrain FMCG Distribution &amp; Beverage Showcase</w:t>
+        <w:t xml:space="preserve">Kingdom of Bahrain FMCG Distribution</w:t>
       </w:r>
     </w:p>
     <w:p>
@@ -480,7 +488,7 @@
           <w:sz w:val="28"/>
           <w:szCs w:val="28"/>
         </w:rPr>
-        <w:t xml:space="preserve">Phase 2: Cold Store Portal &amp; Driver Stop List</w:t>
+        <w:t xml:space="preserve">How the Backend Admin Portal Helps Us Daily</w:t>
       </w:r>
     </w:p>
     <w:p>
@@ -493,7 +501,7 @@
           <w:sz w:val="20"/>
           <w:szCs w:val="20"/>
         </w:rPr>
-        <w:t xml:space="preserve">Let regular baqalas place orders directly, and give drivers a clean stop checklist on their phone.</w:t>
+        <w:t xml:space="preserve">Simple, practical features that make daily tasks faster, organized, and reliable.</w:t>
       </w:r>
     </w:p>
     <w:p>
@@ -507,75 +515,120 @@
           <w:sz w:val="22"/>
           <w:szCs w:val="22"/>
         </w:rPr>
-        <w:t xml:space="preserve">What Cold Stores &amp; Drivers Will Experience:
-</w:t>
-      </w:r>
-      <w:r>
-        <w:rPr>
-          <w:b/>
-          <w:bCs/>
-          <w:sz w:val="20"/>
-          <w:szCs w:val="20"/>
-        </w:rPr>
-        <w:t xml:space="preserve">1. Baqala Wholesale Portal: </w:t>
-      </w:r>
-      <w:r>
-        <w:rPr>
-          <w:sz w:val="20"/>
-          <w:szCs w:val="20"/>
-        </w:rPr>
-        <w:t xml:space="preserve">Partner cold stores enter their CR number once and unlock special wholesale carton rates, reordering at their own convenience.
-</w:t>
-      </w:r>
-      <w:r>
-        <w:rPr>
-          <w:b/>
-          <w:bCs/>
-          <w:sz w:val="20"/>
-          <w:szCs w:val="20"/>
-        </w:rPr>
-        <w:t xml:space="preserve">2. Driver Web Page (/driver): </w:t>
-      </w:r>
-      <w:r>
-        <w:rPr>
-          <w:sz w:val="20"/>
-          <w:szCs w:val="20"/>
-        </w:rPr>
-        <w:t xml:space="preserve">Drivers open a clean mobile page on their phone showing their 10–15 daily delivery stops with store names and carton counts.
-</w:t>
-      </w:r>
-      <w:r>
-        <w:rPr>
-          <w:b/>
-          <w:bCs/>
-          <w:sz w:val="20"/>
-          <w:szCs w:val="20"/>
-        </w:rPr>
-        <w:t xml:space="preserve">3. Clean Delivery Routing: </w:t>
-      </w:r>
-      <w:r>
-        <w:rPr>
-          <w:sz w:val="20"/>
-          <w:szCs w:val="20"/>
-        </w:rPr>
-        <w:t xml:space="preserve">Stops organized cleanly across Muharraq, Manama, and Riffa with direct phone calling for store owners.
-</w:t>
-      </w:r>
-      <w:r>
-        <w:rPr>
-          <w:b/>
-          <w:bCs/>
-          <w:sz w:val="20"/>
-          <w:szCs w:val="20"/>
-        </w:rPr>
-        <w:t xml:space="preserve">4. Digital Delivery Confirmation: </w:t>
-      </w:r>
-      <w:r>
-        <w:rPr>
-          <w:sz w:val="20"/>
-          <w:szCs w:val="20"/>
-        </w:rPr>
-        <w:t xml:space="preserve">Store owner confirms delivery with a quick tap, generating an instant electronic proof of drop-off.
+        <w:t xml:space="preserve">What DAS Staff Sees in the Admin Portal:
+</w:t>
+      </w:r>
+      <w:r>
+        <w:rPr>
+          <w:b/>
+          <w:bCs/>
+          <w:color w:val="059669"/>
+          <w:sz w:val="20"/>
+          <w:szCs w:val="20"/>
+        </w:rPr>
+        <w:t xml:space="preserve">Live Order Desk Example:
+</w:t>
+      </w:r>
+      <w:r>
+        <w:rPr>
+          <w:sz w:val="19"/>
+          <w:szCs w:val="19"/>
+        </w:rPr>
+        <w:t xml:space="preserve">• #1041 — Fatima A. (Riffa) — 2 Cartons Alsi Cola — 6.000 BHD — NEW ORDER
+</w:t>
+      </w:r>
+      <w:r>
+        <w:rPr>
+          <w:sz w:val="19"/>
+          <w:szCs w:val="19"/>
+        </w:rPr>
+        <w:t xml:space="preserve">• #1040 — Al Hidd Cold Store — 10 Cartons Alsi + 5 Code Red — 42.500 BHD — PACKING
+</w:t>
+      </w:r>
+      <w:r>
+        <w:rPr>
+          <w:sz w:val="19"/>
+          <w:szCs w:val="19"/>
+        </w:rPr>
+        <w:t xml:space="preserve">• #1039 — Ali Mansoor (Manama) — 1 Carton Alsi Diet — 3.000 BHD — DISPATCHED
+</w:t>
+      </w:r>
+      <w:r>
+        <w:rPr>
+          <w:b/>
+          <w:bCs/>
+          <w:sz w:val="22"/>
+          <w:szCs w:val="22"/>
+        </w:rPr>
+        <w:t xml:space="preserve">Practical Features:
+</w:t>
+      </w:r>
+      <w:r>
+        <w:rPr>
+          <w:b/>
+          <w:bCs/>
+          <w:sz w:val="20"/>
+          <w:szCs w:val="20"/>
+        </w:rPr>
+        <w:t xml:space="preserve">• Zero Lost Orders: </w:t>
+      </w:r>
+      <w:r>
+        <w:rPr>
+          <w:sz w:val="20"/>
+          <w:szCs w:val="20"/>
+        </w:rPr>
+        <w:t xml:space="preserve">Every BenefitPay and WhatsApp order is logged with timestamp, customer name, and phone number.
+</w:t>
+      </w:r>
+      <w:r>
+        <w:rPr>
+          <w:b/>
+          <w:bCs/>
+          <w:sz w:val="20"/>
+          <w:szCs w:val="20"/>
+        </w:rPr>
+        <w:t xml:space="preserve">• 1-Click Price &amp; Stock Control: </w:t>
+      </w:r>
+      <w:r>
+        <w:rPr>
+          <w:sz w:val="20"/>
+          <w:szCs w:val="20"/>
+        </w:rPr>
+        <w:t xml:space="preserve">Toggle prices or mark out-of-stock on your phone, and the live website updates in 2 seconds.
+</w:t>
+      </w:r>
+      <w:r>
+        <w:rPr>
+          <w:b/>
+          <w:bCs/>
+          <w:sz w:val="20"/>
+          <w:szCs w:val="20"/>
+        </w:rPr>
+        <w:t xml:space="preserve">• Central Bahrain Address Book: </w:t>
+      </w:r>
+      <w:r>
+        <w:rPr>
+          <w:sz w:val="20"/>
+          <w:szCs w:val="20"/>
+        </w:rPr>
+        <w:t xml:space="preserve">All customer addresses (Governorate, Block, Road, Building) stored neatly for dispatch.
+</w:t>
+      </w:r>
+      <w:r>
+        <w:rPr>
+          <w:b/>
+          <w:bCs/>
+          <w:sz w:val="20"/>
+          <w:szCs w:val="20"/>
+        </w:rPr>
+        <w:t xml:space="preserve">• Customer List for Marketing: </w:t>
+      </w:r>
+      <w:r>
+        <w:rPr>
+          <w:sz w:val="20"/>
+          <w:szCs w:val="20"/>
+        </w:rPr>
+        <w:t xml:space="preserve">Export verified phone numbers for WhatsApp promotional broadcasts when new products arrive.
 </w:t>
       </w:r>
     </w:p>
@@ -614,7 +667,7 @@
                 <w:sz w:val="20"/>
                 <w:szCs w:val="20"/>
               </w:rPr>
-              <w:t xml:space="preserve">💡 Why this helps our daily work
+              <w:t xml:space="preserve">Why Staff Will Love It
 </w:t>
             </w:r>
             <w:r>
@@ -623,7 +676,7 @@
                 <w:sz w:val="19"/>
                 <w:szCs w:val="19"/>
               </w:rPr>
-              <w:t xml:space="preserve">Replaces lost paper notes and disorganized WhatsApp chats. The driver knows exactly what needs to be delivered, and cold stores can request stock whenever they run low.</w:t>
+              <w:t xml:space="preserve">Takes 2 minutes to learn. Runs on any phone or laptop browser. Saves hours of back-and-forth phone calls and note-taking every single week.</w:t>
             </w:r>
           </w:p>
         </w:tc>
@@ -642,7 +695,6 @@
     <w:p>
       <w:pPr>
         <w:spacing w:after="40" w:before="100"/>
-        <w:jc w:val="left"/>
       </w:pPr>
       <w:r>
         <w:rPr>
@@ -662,7 +714,7 @@
           <w:sz w:val="18"/>
           <w:szCs w:val="18"/>
         </w:rPr>
-        <w:t xml:space="preserve">   [Phase 3 • Page 4 of 6]</w:t>
+        <w:t xml:space="preserve">   [Phase 1 &amp; 2 • Page 4 of 6]</w:t>
       </w:r>
     </w:p>
     <w:p>
@@ -675,7 +727,7 @@
           <w:sz w:val="18"/>
           <w:szCs w:val="18"/>
         </w:rPr>
-        <w:t xml:space="preserve">Kingdom of Bahrain FMCG Distribution &amp; Beverage Showcase</w:t>
+        <w:t xml:space="preserve">Kingdom of Bahrain FMCG Distribution</w:t>
       </w:r>
     </w:p>
     <w:p>
@@ -691,7 +743,7 @@
           <w:sz w:val="28"/>
           <w:szCs w:val="28"/>
         </w:rPr>
-        <w:t xml:space="preserve">Phase 3: Daily Stock &amp; Cash Reconciliation</w:t>
+        <w:t xml:space="preserve">Customer Tracking &amp; Cold Store Accounts</w:t>
       </w:r>
     </w:p>
     <w:p>
@@ -704,7 +756,7 @@
           <w:sz w:val="20"/>
           <w:szCs w:val="20"/>
         </w:rPr>
-        <w:t xml:space="preserve">Simple, foolproof checks when vans return to the warehouse at the end of the shift.</w:t>
+        <w:t xml:space="preserve">Features that boost repeat orders and build loyalty as part of our sales expansion.</w:t>
       </w:r>
     </w:p>
     <w:p>
@@ -718,62 +770,62 @@
           <w:sz w:val="22"/>
           <w:szCs w:val="22"/>
         </w:rPr>
-        <w:t xml:space="preserve">What Management &amp; Drivers Will Experience:
-</w:t>
-      </w:r>
-      <w:r>
-        <w:rPr>
-          <w:b/>
-          <w:bCs/>
-          <w:sz w:val="20"/>
-          <w:szCs w:val="20"/>
-        </w:rPr>
-        <w:t xml:space="preserve">1. Morning vs. Evening Counts: </w:t>
-      </w:r>
-      <w:r>
-        <w:rPr>
-          <w:sz w:val="20"/>
-          <w:szCs w:val="20"/>
-        </w:rPr>
-        <w:t xml:space="preserve">Quickly record how many cartons left the warehouse in the morning and how many returned in the evening.
-</w:t>
-      </w:r>
-      <w:r>
-        <w:rPr>
-          <w:b/>
-          <w:bCs/>
-          <w:sz w:val="20"/>
-          <w:szCs w:val="20"/>
-        </w:rPr>
-        <w:t xml:space="preserve">2. Cash &amp; BenefitPay Settlement:
-</w:t>
-      </w:r>
-      <w:r>
-        <w:rPr>
-          <w:sz w:val="19"/>
-          <w:szCs w:val="19"/>
-        </w:rPr>
-        <w:t xml:space="preserve">   • Morning Load-Out: 100 Cartons
-   • Evening Returns: 15 Cartons
-   • Verified Sold: 85 Cartons
-   • Cash Collected + BenefitPay Receipts = Exactly 85 Cartons balanced.
-</w:t>
-      </w:r>
-      <w:r>
-        <w:rPr>
-          <w:b/>
-          <w:bCs/>
-          <w:sz w:val="20"/>
-          <w:szCs w:val="20"/>
-        </w:rPr>
-        <w:t xml:space="preserve">3. Driver Performance Bonuses: </w:t>
-      </w:r>
-      <w:r>
-        <w:rPr>
-          <w:sz w:val="20"/>
-          <w:szCs w:val="20"/>
-        </w:rPr>
-        <w:t xml:space="preserve">Optional commission ledger calculating daily incentives for drivers who hit sales milestones.
+        <w:t xml:space="preserve">Expansion Steps 1 &amp; 2 — Marketing &amp; Retention:
+</w:t>
+      </w:r>
+      <w:r>
+        <w:rPr>
+          <w:b/>
+          <w:bCs/>
+          <w:sz w:val="20"/>
+          <w:szCs w:val="20"/>
+        </w:rPr>
+        <w:t xml:space="preserve">1. Customer Login &amp; 1-Tap Reorder: </w:t>
+      </w:r>
+      <w:r>
+        <w:rPr>
+          <w:sz w:val="20"/>
+          <w:szCs w:val="20"/>
+        </w:rPr>
+        <w:t xml:space="preserve">Customers sign in with their mobile number. They see past purchases and can reorder their favorite Alsi Cola case in 10 seconds.
+</w:t>
+      </w:r>
+      <w:r>
+        <w:rPr>
+          <w:b/>
+          <w:bCs/>
+          <w:sz w:val="20"/>
+          <w:szCs w:val="20"/>
+        </w:rPr>
+        <w:t xml:space="preserve">2. Baqala Wholesale Portal: </w:t>
+      </w:r>
+      <w:r>
+        <w:rPr>
+          <w:sz w:val="20"/>
+          <w:szCs w:val="20"/>
+        </w:rPr>
+        <w:t xml:space="preserve">Cold stores enter their Bahrain CR number to unlock discounted wholesale carton rates, reordering from their bed at night.
+</w:t>
+      </w:r>
+      <w:r>
+        <w:rPr>
+          <w:b/>
+          <w:bCs/>
+          <w:sz w:val="20"/>
+          <w:szCs w:val="20"/>
+        </w:rPr>
+        <w:t xml:space="preserve">3. Live 5-Stage Order Pipeline:
+</w:t>
+      </w:r>
+      <w:r>
+        <w:rPr>
+          <w:b/>
+          <w:bCs/>
+          <w:color w:val="059669"/>
+          <w:sz w:val="20"/>
+          <w:szCs w:val="20"/>
+        </w:rPr>
+        <w:t xml:space="preserve">   [1. Received] -&gt; [2. Confirmed] -&gt; [3. Packed at Hub] -&gt; [4. In Van] -&gt; [5. At Your Door]
 </w:t>
       </w:r>
     </w:p>
@@ -812,7 +864,7 @@
                 <w:sz w:val="20"/>
                 <w:szCs w:val="20"/>
               </w:rPr>
-              <w:t xml:space="preserve">💡 Why this helps our daily work
+              <w:t xml:space="preserve">Commercial Value for DAS Bahrain
 </w:t>
             </w:r>
             <w:r>
@@ -821,7 +873,7 @@
                 <w:sz w:val="19"/>
                 <w:szCs w:val="19"/>
               </w:rPr>
-              <w:t xml:space="preserve">Gives management complete clarity that every carton of Alsi Cola is accounted for before drivers wrap up their day. No missing inventory, no cash shortfalls.</w:t>
+              <w:t xml:space="preserve">Customers stop calling to ask 'where is my drink order?'. They see their delivery status live, while baqalas can request stock whenever they run low.</w:t>
             </w:r>
           </w:p>
         </w:tc>
@@ -840,7 +892,6 @@
     <w:p>
       <w:pPr>
         <w:spacing w:after="40" w:before="100"/>
-        <w:jc w:val="left"/>
       </w:pPr>
       <w:r>
         <w:rPr>
@@ -860,7 +911,7 @@
           <w:sz w:val="18"/>
           <w:szCs w:val="18"/>
         </w:rPr>
-        <w:t xml:space="preserve">   [Phase 4 • Page 5 of 6]</w:t>
+        <w:t xml:space="preserve">   [Phase 3 &amp; 4 • Page 5 of 6]</w:t>
       </w:r>
     </w:p>
     <w:p>
@@ -873,7 +924,7 @@
           <w:sz w:val="18"/>
           <w:szCs w:val="18"/>
         </w:rPr>
-        <w:t xml:space="preserve">Kingdom of Bahrain FMCG Distribution &amp; Beverage Showcase</w:t>
+        <w:t xml:space="preserve">Kingdom of Bahrain FMCG Distribution</w:t>
       </w:r>
     </w:p>
     <w:p>
@@ -889,7 +940,7 @@
           <w:sz w:val="28"/>
           <w:szCs w:val="28"/>
         </w:rPr>
-        <w:t xml:space="preserve">Phase 4: Staff Records, Payroll &amp; 10% VAT</w:t>
+        <w:t xml:space="preserve">Van Delivery Checklist &amp; Daily Cash Check</w:t>
       </w:r>
     </w:p>
     <w:p>
@@ -902,7 +953,7 @@
           <w:sz w:val="20"/>
           <w:szCs w:val="20"/>
         </w:rPr>
-        <w:t xml:space="preserve">Simple administrative automations introduced as the team and order volume expand.</w:t>
+        <w:t xml:space="preserve">Tools introduced as van routes expand, ensuring zero lost stock and seamless compliance.</w:t>
       </w:r>
     </w:p>
     <w:p>
@@ -916,75 +967,75 @@
           <w:sz w:val="22"/>
           <w:szCs w:val="22"/>
         </w:rPr>
-        <w:t xml:space="preserve">What Management &amp; Finance Will Experience:
-</w:t>
-      </w:r>
-      <w:r>
-        <w:rPr>
-          <w:b/>
-          <w:bCs/>
-          <w:sz w:val="20"/>
-          <w:szCs w:val="20"/>
-        </w:rPr>
-        <w:t xml:space="preserve">1. CPR &amp; Visa Expiry Alerts: </w:t>
-      </w:r>
-      <w:r>
-        <w:rPr>
-          <w:sz w:val="20"/>
-          <w:szCs w:val="20"/>
-        </w:rPr>
-        <w:t xml:space="preserve">Tracks employee CPR, driving licenses, and LMRA work permits with 60-day renewal warnings to avoid fines.
-</w:t>
-      </w:r>
-      <w:r>
-        <w:rPr>
-          <w:b/>
-          <w:bCs/>
-          <w:sz w:val="20"/>
-          <w:szCs w:val="20"/>
-        </w:rPr>
-        <w:t xml:space="preserve">2. 1-Click Bank Salary File (WPS): </w:t>
-      </w:r>
-      <w:r>
-        <w:rPr>
-          <w:sz w:val="20"/>
-          <w:szCs w:val="20"/>
-        </w:rPr>
-        <w:t xml:space="preserve">Exports the exact Wages Protection System (SIF) file required by Bahrain banks (NBB, BBK, Ila, AUB) for monthly salaries.
-</w:t>
-      </w:r>
-      <w:r>
-        <w:rPr>
-          <w:b/>
-          <w:bCs/>
-          <w:sz w:val="20"/>
-          <w:szCs w:val="20"/>
-        </w:rPr>
-        <w:t xml:space="preserve">3. Automatic 10% Tax Invoices: </w:t>
-      </w:r>
-      <w:r>
-        <w:rPr>
-          <w:sz w:val="20"/>
-          <w:szCs w:val="20"/>
-        </w:rPr>
-        <w:t xml:space="preserve">Generates compliant Bahrain tax receipts for cold stores showing DAS CR and VAT numbers automatically.
-</w:t>
-      </w:r>
-      <w:r>
-        <w:rPr>
-          <w:b/>
-          <w:bCs/>
-          <w:sz w:val="20"/>
-          <w:szCs w:val="20"/>
-        </w:rPr>
-        <w:t xml:space="preserve">4. 5-Minute NBR VAT Filing: </w:t>
-      </w:r>
-      <w:r>
-        <w:rPr>
-          <w:sz w:val="20"/>
-          <w:szCs w:val="20"/>
-        </w:rPr>
-        <w:t xml:space="preserve">Summarizes Input VAT on stock purchases vs. Output VAT on drink sales for effortless quarterly filing.
+        <w:t xml:space="preserve">Expansion Steps 3 &amp; 4 — Operations &amp; Compliance:
+</w:t>
+      </w:r>
+      <w:r>
+        <w:rPr>
+          <w:b/>
+          <w:bCs/>
+          <w:sz w:val="20"/>
+          <w:szCs w:val="20"/>
+        </w:rPr>
+        <w:t xml:space="preserve">1. Driver Phone Checklist: </w:t>
+      </w:r>
+      <w:r>
+        <w:rPr>
+          <w:sz w:val="20"/>
+          <w:szCs w:val="20"/>
+        </w:rPr>
+        <w:t xml:space="preserve">Van drivers open a simple mobile page showing today's delivery stops with store names, crate counts, and 1-tap phone calls.
+</w:t>
+      </w:r>
+      <w:r>
+        <w:rPr>
+          <w:b/>
+          <w:bCs/>
+          <w:sz w:val="20"/>
+          <w:szCs w:val="20"/>
+        </w:rPr>
+        <w:t xml:space="preserve">2. 6:00 PM Stock &amp; Cash Tally: </w:t>
+      </w:r>
+      <w:r>
+        <w:rPr>
+          <w:sz w:val="20"/>
+          <w:szCs w:val="20"/>
+        </w:rPr>
+        <w:t xml:space="preserve">Morning crates loaded vs. evening returns = verified crates sold. Cash + BenefitPay receipts must match 100% before drivers leave.
+</w:t>
+      </w:r>
+      <w:r>
+        <w:rPr>
+          <w:b/>
+          <w:bCs/>
+          <w:sz w:val="20"/>
+          <w:szCs w:val="20"/>
+        </w:rPr>
+        <w:t xml:space="preserve">3. LMRA &amp; Visa Expiry Warnings: </w:t>
+      </w:r>
+      <w:r>
+        <w:rPr>
+          <w:sz w:val="20"/>
+          <w:szCs w:val="20"/>
+        </w:rPr>
+        <w:t xml:space="preserve">Automatic 60-day alerts for driver CPR, driving licenses, and work permits.
+</w:t>
+      </w:r>
+      <w:r>
+        <w:rPr>
+          <w:b/>
+          <w:bCs/>
+          <w:sz w:val="20"/>
+          <w:szCs w:val="20"/>
+        </w:rPr>
+        <w:t xml:space="preserve">4. 1-Click WPS Bank Salary File: </w:t>
+      </w:r>
+      <w:r>
+        <w:rPr>
+          <w:sz w:val="20"/>
+          <w:szCs w:val="20"/>
+        </w:rPr>
+        <w:t xml:space="preserve">Generates the exact SIF payroll file required by Bahrain banks (NBB, BBK, Ila, AUB) for monthly wages.
 </w:t>
       </w:r>
     </w:p>
@@ -1023,7 +1074,7 @@
                 <w:sz w:val="20"/>
                 <w:szCs w:val="20"/>
               </w:rPr>
-              <w:t xml:space="preserve">💡 Why this helps our daily work
+              <w:t xml:space="preserve">Why this protects our margins
 </w:t>
             </w:r>
             <w:r>
@@ -1032,7 +1083,7 @@
                 <w:sz w:val="19"/>
                 <w:szCs w:val="19"/>
               </w:rPr>
-              <w:t xml:space="preserve">Keeps DAS Bahrain in full compliance with LMRA, Ministry of Labour WPS rules, and NBR VAT guidelines with minimal office overhead.</w:t>
+              <w:t xml:space="preserve">Eliminates lost delivery notes, prevents missing inventory, and ensures all cash is deposited safely at the end of each shift.</w:t>
             </w:r>
           </w:p>
         </w:tc>
@@ -1051,7 +1102,6 @@
     <w:p>
       <w:pPr>
         <w:spacing w:after="40" w:before="100"/>
-        <w:jc w:val="left"/>
       </w:pPr>
       <w:r>
         <w:rPr>
@@ -1071,7 +1121,7 @@
           <w:sz w:val="18"/>
           <w:szCs w:val="18"/>
         </w:rPr>
-        <w:t xml:space="preserve">   [Summary • Page 6 of 6]</w:t>
+        <w:t xml:space="preserve">   [Roadmap Summary • Page 6 of 6]</w:t>
       </w:r>
     </w:p>
     <w:p>
@@ -1084,7 +1134,7 @@
           <w:sz w:val="18"/>
           <w:szCs w:val="18"/>
         </w:rPr>
-        <w:t xml:space="preserve">Kingdom of Bahrain FMCG Distribution &amp; Beverage Showcase</w:t>
+        <w:t xml:space="preserve">Kingdom of Bahrain FMCG Distribution</w:t>
       </w:r>
     </w:p>
     <w:p>
@@ -1100,7 +1150,7 @@
           <w:sz w:val="28"/>
           <w:szCs w:val="28"/>
         </w:rPr>
-        <w:t xml:space="preserve">The Bottom Line: A Practical, Low-Risk Path Forward</w:t>
+        <w:t xml:space="preserve">How We Move Forward at Our Own Pace</w:t>
       </w:r>
     </w:p>
     <w:p>
@@ -1113,12 +1163,12 @@
           <w:sz w:val="20"/>
           <w:szCs w:val="20"/>
         </w:rPr>
-        <w:t xml:space="preserve">Tailored specifically for our current size, with no rush and zero unnecessary software costs.</w:t>
-      </w:r>
-    </w:p>
-    <w:p>
-      <w:pPr>
-        <w:spacing w:after="120"/>
+        <w:t xml:space="preserve">A simple path to start benefiting from the platform today without taking on unnecessary risks.</w:t>
+      </w:r>
+    </w:p>
+    <w:p>
+      <w:pPr>
+        <w:spacing w:after="100"/>
       </w:pPr>
       <w:r>
         <w:rPr>
@@ -1127,75 +1177,75 @@
           <w:sz w:val="22"/>
           <w:szCs w:val="22"/>
         </w:rPr>
-        <w:t xml:space="preserve">Why This Approach Wins for DAS Bahrain:
-</w:t>
-      </w:r>
-      <w:r>
-        <w:rPr>
-          <w:b/>
-          <w:bCs/>
-          <w:sz w:val="20"/>
-          <w:szCs w:val="20"/>
-        </w:rPr>
-        <w:t xml:space="preserve">• Spread Out at Our Own Pace: </w:t>
-      </w:r>
-      <w:r>
-        <w:rPr>
-          <w:sz w:val="20"/>
-          <w:szCs w:val="20"/>
-        </w:rPr>
-        <w:t xml:space="preserve">Each phase is completely independent. We only move to the next phase when the business demands it and the team is ready.
-</w:t>
-      </w:r>
-      <w:r>
-        <w:rPr>
-          <w:b/>
-          <w:bCs/>
-          <w:sz w:val="20"/>
-          <w:szCs w:val="20"/>
-        </w:rPr>
-        <w:t xml:space="preserve">• 0 BHD Monthly Software Fees: </w:t>
-      </w:r>
-      <w:r>
-        <w:rPr>
-          <w:sz w:val="20"/>
-          <w:szCs w:val="20"/>
-        </w:rPr>
-        <w:t xml:space="preserve">We avoid foreign software subscriptions (which cost 1,000+ BHD/month) by using our own lightweight web tools.
-</w:t>
-      </w:r>
-      <w:r>
-        <w:rPr>
-          <w:b/>
-          <w:bCs/>
-          <w:sz w:val="20"/>
-          <w:szCs w:val="20"/>
-        </w:rPr>
-        <w:t xml:space="preserve">• Zero Disruption to Customers: </w:t>
-      </w:r>
-      <w:r>
-        <w:rPr>
-          <w:sz w:val="20"/>
-          <w:szCs w:val="20"/>
-        </w:rPr>
-        <w:t xml:space="preserve">Our current website stays active 24/7. Shoppers and buyers can continue browsing and ordering without any interruption.
-</w:t>
-      </w:r>
-      <w:r>
-        <w:rPr>
-          <w:b/>
-          <w:bCs/>
-          <w:sz w:val="20"/>
-          <w:szCs w:val="20"/>
-        </w:rPr>
-        <w:t xml:space="preserve">• Tailored for Bahrain FMCG: </w:t>
-      </w:r>
-      <w:r>
-        <w:rPr>
-          <w:sz w:val="20"/>
-          <w:szCs w:val="20"/>
-        </w:rPr>
-        <w:t xml:space="preserve">Designed specifically around neighborhood cold stores, local van routes, BenefitPay, and Bahrain regulations.
+        <w:t xml:space="preserve">Grounded 4-Step Rollout:
+</w:t>
+      </w:r>
+      <w:r>
+        <w:rPr>
+          <w:b/>
+          <w:bCs/>
+          <w:sz w:val="20"/>
+          <w:szCs w:val="20"/>
+        </w:rPr>
+        <w:t xml:space="preserve">Step 1: Connect Cloud Database — </w:t>
+      </w:r>
+      <w:r>
+        <w:rPr>
+          <w:sz w:val="20"/>
+          <w:szCs w:val="20"/>
+        </w:rPr>
+        <w:t xml:space="preserve">Set up the secure cloud database and backend admin screen. Staff starts managing live orders and catalogue.
+</w:t>
+      </w:r>
+      <w:r>
+        <w:rPr>
+          <w:b/>
+          <w:bCs/>
+          <w:sz w:val="20"/>
+          <w:szCs w:val="20"/>
+        </w:rPr>
+        <w:t xml:space="preserve">Step 2: Customer Order Tracking — </w:t>
+      </w:r>
+      <w:r>
+        <w:rPr>
+          <w:sz w:val="20"/>
+          <w:szCs w:val="20"/>
+        </w:rPr>
+        <w:t xml:space="preserve">Once comfortable with the admin portal, activate customer accounts and live order tracking to build repeat buyers.
+</w:t>
+      </w:r>
+      <w:r>
+        <w:rPr>
+          <w:b/>
+          <w:bCs/>
+          <w:sz w:val="20"/>
+          <w:szCs w:val="20"/>
+        </w:rPr>
+        <w:t xml:space="preserve">Step 3: Cold Store &amp; Van Routes — </w:t>
+      </w:r>
+      <w:r>
+        <w:rPr>
+          <w:sz w:val="20"/>
+          <w:szCs w:val="20"/>
+        </w:rPr>
+        <w:t xml:space="preserve">Give partner cold stores their login and equip van drivers with a mobile delivery stop checklist.
+</w:t>
+      </w:r>
+      <w:r>
+        <w:rPr>
+          <w:b/>
+          <w:bCs/>
+          <w:sz w:val="20"/>
+          <w:szCs w:val="20"/>
+        </w:rPr>
+        <w:t xml:space="preserve">Step 4: Cash Audit &amp; HR Compliance — </w:t>
+      </w:r>
+      <w:r>
+        <w:rPr>
+          <w:sz w:val="20"/>
+          <w:szCs w:val="20"/>
+        </w:rPr>
+        <w:t xml:space="preserve">Introduce daily van cash reconciliation, LMRA visa reminders, and WPS payroll exports when volume demands it.
 </w:t>
       </w:r>
     </w:p>
@@ -1234,7 +1284,7 @@
                 <w:sz w:val="20"/>
                 <w:szCs w:val="20"/>
               </w:rPr>
-              <w:t xml:space="preserve">💡 Next Step for Discussion
+              <w:t xml:space="preserve">Recommendation for Internal Discussion
 </w:t>
             </w:r>
             <w:r>
@@ -1243,7 +1293,7 @@
                 <w:sz w:val="19"/>
                 <w:szCs w:val="19"/>
               </w:rPr>
-              <w:t xml:space="preserve">When the team is ready, we can explore starting with Phase 1 (Customer Accounts &amp; Order Status) as a quiet, gradual upgrade. In the meantime, our current live website continues to serve customers and take wholesale inquiries across Bahrain smoothly.</w:t>
+              <w:t xml:space="preserve">We suggest beginning with Step 1 (Connecting the Cloud Database &amp; Backend Admin Portal). It requires zero downtime, costs virtually nothing to run on modern cloud tiers, and immediately gives our staff a clean, centralized workspace to manage daily orders and customer contacts.</w:t>
             </w:r>
           </w:p>
         </w:tc>

</xml_diff>